<commit_message>
docs: 설정서 v1.1 §24.1 오르골 스탯 8/11/15 반영(docx 원본+사본) · NSG-017 승격 ITM-007/D-025
</commit_message>
<xml_diff>
--- a/docs/SETTING_BIBLE_v1.1.docx
+++ b/docs/SETTING_BIBLE_v1.1.docx
@@ -11545,14 +11545,15 @@
             <w:pPr>
               <w:spacing w:after="0"/>
             </w:pPr>
-            <w:r/>
+            <w:r>
+              <w:t>11</w:t>
+            </w:r>
             <w:r>
               <w:rPr>
                 <w:rFonts w:ascii="Noto Sans CJK KR" w:hAnsi="Noto Sans CJK KR" w:eastAsia="Noto Sans CJK KR"/>
                 <w:b w:val="0"/>
                 <w:sz w:val="18"/>
               </w:rPr>
-              <w:t>12</w:t>
             </w:r>
           </w:p>
         </w:tc>
@@ -11571,19 +11572,28 @@
             <w:pPr>
               <w:spacing w:after="0"/>
             </w:pPr>
-            <w:r/>
+            <w:r>
+              <w:t>15</w:t>
+            </w:r>
             <w:r>
               <w:rPr>
                 <w:rFonts w:ascii="Noto Sans CJK KR" w:hAnsi="Noto Sans CJK KR" w:eastAsia="Noto Sans CJK KR"/>
                 <w:b w:val="0"/>
                 <w:sz w:val="18"/>
               </w:rPr>
-              <w:t>14</w:t>
             </w:r>
           </w:p>
         </w:tc>
       </w:tr>
     </w:tbl>
+    <w:p>
+      <w:r>
+        <w:rPr>
+          <w:i/>
+        </w:rPr>
+        <w:t>※ 2026-08-19 개정 (D-021): 초기 스탯을 8/12/14 → 8/11/15로 정정. 오너가 소설 원문을 재검토해 확정했으며, 합계 34는 동일하므로 새 설정이 아니라 통합 과정에서 어긋난 배분을 원문으로 되돌린 것이다.</w:t>
+      </w:r>
+    </w:p>
     <w:p>
       <w:pPr>
         <w:spacing w:after="20"/>
@@ -12906,6 +12916,20 @@
           <w:sz w:val="20"/>
         </w:rPr>
         <w:t>스탯을 힘/민첩/지능 3종으로 통합하고 파생 능력은 내부값으로 변경.</w:t>
+      </w:r>
+    </w:p>
+    <w:p>
+      <w:pPr>
+        <w:pStyle w:val="ListBullet"/>
+        <w:spacing w:after="50"/>
+        <w:widowControl w:val="1"/>
+      </w:pPr>
+      <w:r>
+        <w:rPr>
+          <w:rFonts w:ascii="Noto Sans CJK KR" w:hAnsi="Noto Sans CJK KR" w:eastAsia="Noto Sans CJK KR"/>
+          <w:sz w:val="20"/>
+        </w:rPr>
+        <w:t>(2026-08-19 개정) 오르골 초기 스탯을 8/12/14에서 8/11/15로 정정. 근거: 소설 원문 재검토 · DECISIONS D-021.</w:t>
       </w:r>
     </w:p>
     <w:p>

</xml_diff>